<commit_message>
Cierra entrega con Streamlit y registra verificacion funcional
</commit_message>
<xml_diff>
--- a/docs/Diseno_Ajustado_StreamRetain.docx
+++ b/docs/Diseno_Ajustado_StreamRetain.docx
@@ -8986,6 +8986,11 @@
       </w:r>
     </w:p>
     <w:p>
+      <w:r>
+        <w:br w:type="page"/>
+      </w:r>
+    </w:p>
+    <w:p>
       <w:pPr>
         <w:pStyle w:val="Heading2"/>
       </w:pPr>
@@ -9223,7 +9228,7 @@
                 <w:color w:val="FFFFFF"/>
                 <w:sz w:val="15"/>
               </w:rPr>
-              <w:t>Evidencia (log, minuto del video)</w:t>
+              <w:t>Evidencia (CSV y logs)</w:t>
             </w:r>
           </w:p>
         </w:tc>
@@ -9337,7 +9342,7 @@
                 <w:i w:val="0"/>
                 <w:sz w:val="15"/>
               </w:rPr>
-              <w:t>detalle_por_caso.csv (M1_accuracy); logs detalle_*_s1001; video: [pendiente]</w:t>
+              <w:t>detalle_por_caso.csv (M1_accuracy); logs detalle_*_s1001.jsonl.gz</w:t>
             </w:r>
           </w:p>
         </w:tc>
@@ -9458,7 +9463,7 @@
                 <w:i w:val="0"/>
                 <w:sz w:val="15"/>
               </w:rPr>
-              <w:t>detalle_por_caso.csv (M1R_balanced_accuracy); logs detalle_*_s1001; video: [pendiente]</w:t>
+              <w:t>detalle_por_caso.csv (M1R_balanced_accuracy); logs detalle_*_s1001.jsonl.gz</w:t>
             </w:r>
           </w:p>
         </w:tc>
@@ -9572,7 +9577,7 @@
                 <w:i w:val="0"/>
                 <w:sz w:val="15"/>
               </w:rPr>
-              <w:t>detalle_por_caso.csv (M2_recall); logs detalle_*_s1001; video: [pendiente]</w:t>
+              <w:t>detalle_por_caso.csv (M2_recall); logs detalle_*_s1001.jsonl.gz</w:t>
             </w:r>
           </w:p>
         </w:tc>
@@ -9693,7 +9698,7 @@
                 <w:i w:val="0"/>
                 <w:sz w:val="15"/>
               </w:rPr>
-              <w:t>detalle_por_caso.csv (M3_precision_top_k); logs detalle_*_s1001; video: [pendiente]</w:t>
+              <w:t>detalle_por_caso.csv (M3_precision_top_k); logs detalle_*_s1001.jsonl.gz</w:t>
             </w:r>
           </w:p>
         </w:tc>
@@ -9807,7 +9812,7 @@
                 <w:i w:val="0"/>
                 <w:sz w:val="15"/>
               </w:rPr>
-              <w:t>detalle_por_caso.csv (M4_auc); logs detalle_*_s1001; video: [pendiente]</w:t>
+              <w:t>detalle_por_caso.csv (M4_auc); logs detalle_*_s1001.jsonl.gz</w:t>
             </w:r>
           </w:p>
         </w:tc>
@@ -9928,7 +9933,7 @@
                 <w:i w:val="0"/>
                 <w:sz w:val="15"/>
               </w:rPr>
-              <w:t>detalle_por_caso.csv (M5_robustez); logs detalle_*_s1001; video: [pendiente]</w:t>
+              <w:t>detalle_por_caso.csv (M5_robustez); logs detalle_*_s1001.jsonl.gz</w:t>
             </w:r>
           </w:p>
         </w:tc>
@@ -10042,7 +10047,7 @@
                 <w:i w:val="0"/>
                 <w:sz w:val="15"/>
               </w:rPr>
-              <w:t>detalle_por_caso.csv (M6_latencia_media_s); logs detalle_*_s1001; video: [pendiente]</w:t>
+              <w:t>detalle_por_caso.csv (M6_latencia_media_s); logs detalle_*_s1001.jsonl.gz</w:t>
             </w:r>
           </w:p>
         </w:tc>
@@ -10624,26 +10629,6 @@
           <w:i w:val="0"/>
         </w:rPr>
         <w:t xml:space="preserve"> https://streamretain-agent.streamlit.app/</w:t>
-      </w:r>
-    </w:p>
-    <w:p>
-      <w:pPr>
-        <w:pStyle w:val="ListBullet"/>
-        <w:spacing w:after="40"/>
-      </w:pPr>
-      <w:r>
-        <w:rPr>
-          <w:b/>
-          <w:i w:val="0"/>
-        </w:rPr>
-        <w:t>Video de respaldo:</w:t>
-      </w:r>
-      <w:r>
-        <w:rPr>
-          <w:b w:val="0"/>
-          <w:i w:val="0"/>
-        </w:rPr>
-        <w:t xml:space="preserve"> [pendiente]</w:t>
       </w:r>
     </w:p>
     <w:p>

</xml_diff>